<commit_message>
Improve Pickle Rick security analysis
</commit_message>
<xml_diff>
--- a/Pickle-Rick-Writeup-Redacted.docx
+++ b/Pickle-Rick-Writeup-Redacted.docx
@@ -188,9 +188,6 @@
         <w:shd w:val="clear" w:color="auto" w:fill="F4F6F9"/>
         <w:spacing w:before="40" w:line="240" w:lineRule="auto"/>
         <w:ind w:left="202" w:right="72"/>
-        <w:rPr>
-          <w:rFonts w:hint="eastAsia"/>
-        </w:rPr>
       </w:pPr>
       <w:r>
         <w:rPr>
@@ -410,9 +407,6 @@
         <w:shd w:val="clear" w:color="auto" w:fill="F4F6F9"/>
         <w:spacing w:before="40" w:line="240" w:lineRule="auto"/>
         <w:ind w:left="202" w:right="72"/>
-        <w:rPr>
-          <w:rFonts w:hint="eastAsia"/>
-        </w:rPr>
       </w:pPr>
       <w:r>
         <w:rPr>
@@ -586,7 +580,6 @@
           <w:b/>
           <w:color w:val="1F4D78"/>
         </w:rPr>
-        <w:lastRenderedPageBreak/>
         <w:t xml:space="preserve">Password candidate: </w:t>
       </w:r>
       <w:r>
@@ -731,9 +724,6 @@
         <w:shd w:val="clear" w:color="auto" w:fill="F4F6F9"/>
         <w:spacing w:before="40" w:line="240" w:lineRule="auto"/>
         <w:ind w:left="202" w:right="72"/>
-        <w:rPr>
-          <w:rFonts w:hint="eastAsia"/>
-        </w:rPr>
       </w:pPr>
       <w:r>
         <w:rPr>
@@ -754,7 +744,6 @@
         <w:rPr>
           <w:rFonts w:cs="Calibri"/>
         </w:rPr>
-        <w:lastRenderedPageBreak/>
         <w:t>Evidence - Listing the files in the web directory.</w:t>
       </w:r>
     </w:p>
@@ -824,9 +813,6 @@
         <w:shd w:val="clear" w:color="auto" w:fill="F4F6F9"/>
         <w:spacing w:before="40" w:line="240" w:lineRule="auto"/>
         <w:ind w:left="202" w:right="72"/>
-        <w:rPr>
-          <w:rFonts w:hint="eastAsia"/>
-        </w:rPr>
       </w:pPr>
       <w:r>
         <w:rPr>
@@ -952,9 +938,6 @@
         <w:shd w:val="clear" w:color="auto" w:fill="F4F6F9"/>
         <w:spacing w:before="40" w:line="240" w:lineRule="auto"/>
         <w:ind w:left="202" w:right="72"/>
-        <w:rPr>
-          <w:rFonts w:hint="eastAsia"/>
-        </w:rPr>
       </w:pPr>
       <w:r>
         <w:rPr>
@@ -975,7 +958,6 @@
         <w:rPr>
           <w:rFonts w:cs="Calibri"/>
         </w:rPr>
-        <w:lastRenderedPageBreak/>
         <w:t>Evidence - Root filesystem listing.</w:t>
       </w:r>
     </w:p>
@@ -1036,9 +1018,6 @@
         <w:shd w:val="clear" w:color="auto" w:fill="F4F6F9"/>
         <w:spacing w:before="40" w:line="240" w:lineRule="auto"/>
         <w:ind w:left="202" w:right="72"/>
-        <w:rPr>
-          <w:rFonts w:hint="eastAsia"/>
-        </w:rPr>
       </w:pPr>
       <w:r>
         <w:rPr>
@@ -1119,9 +1098,6 @@
         <w:shd w:val="clear" w:color="auto" w:fill="F4F6F9"/>
         <w:spacing w:before="40" w:line="240" w:lineRule="auto"/>
         <w:ind w:left="202" w:right="72"/>
-        <w:rPr>
-          <w:rFonts w:hint="eastAsia"/>
-        </w:rPr>
       </w:pPr>
       <w:r>
         <w:rPr>
@@ -1210,16 +1186,12 @@
         <w:shd w:val="clear" w:color="auto" w:fill="F4F6F9"/>
         <w:spacing w:before="40" w:line="240" w:lineRule="auto"/>
         <w:ind w:left="202" w:right="72"/>
-        <w:rPr>
-          <w:rFonts w:hint="eastAsia"/>
-        </w:rPr>
       </w:pPr>
       <w:r>
         <w:rPr>
           <w:rFonts w:cs="Consolas"/>
           <w:color w:val="0B2545"/>
         </w:rPr>
-        <w:lastRenderedPageBreak/>
         <w:t>less /home/rick/"second ingredients"</w:t>
       </w:r>
     </w:p>
@@ -1339,9 +1311,6 @@
         <w:shd w:val="clear" w:color="auto" w:fill="F4F6F9"/>
         <w:spacing w:before="40" w:line="240" w:lineRule="auto"/>
         <w:ind w:left="202" w:right="72"/>
-        <w:rPr>
-          <w:rFonts w:hint="eastAsia"/>
-        </w:rPr>
       </w:pPr>
       <w:r>
         <w:rPr>
@@ -1423,11 +1392,7 @@
     </w:p>
     <w:p>
       <w:r>
-        <w:rPr>
-          <w:rFonts w:cs="Calibri"/>
-          <w:color w:val="000000"/>
-        </w:rPr>
-        <w:t>To determine whether the web-service account could execute commands with elevated privileges, I tested access to the root user's home directory using sudo ls /root. The command executed successfully without requesting a password, confirming that the account had excessive sudo privileges.</w:t>
+        <w:t>To determine whether the web-service account could execute commands with elevated privileges, I tested access to the root user's home directory using sudo ls /root. The command executed successfully without requesting a password, demonstrating that the web-service account could use sudo to access privileged resources. Because a complete sudo -l output was not captured, the exact scope of the account's sudo permissions was not verified.</w:t>
       </w:r>
     </w:p>
     <w:p>
@@ -1440,9 +1405,6 @@
         <w:shd w:val="clear" w:color="auto" w:fill="F4F6F9"/>
         <w:spacing w:before="40" w:line="240" w:lineRule="auto"/>
         <w:ind w:left="202" w:right="72"/>
-        <w:rPr>
-          <w:rFonts w:hint="eastAsia"/>
-        </w:rPr>
       </w:pPr>
       <w:r>
         <w:rPr>
@@ -1463,7 +1425,6 @@
         <w:rPr>
           <w:rFonts w:cs="Calibri"/>
         </w:rPr>
-        <w:lastRenderedPageBreak/>
         <w:t>Evidence - Elevated listing of /root.</w:t>
       </w:r>
     </w:p>
@@ -1532,9 +1493,6 @@
         <w:shd w:val="clear" w:color="auto" w:fill="F4F6F9"/>
         <w:spacing w:before="40" w:line="240" w:lineRule="auto"/>
         <w:ind w:left="202" w:right="72"/>
-        <w:rPr>
-          <w:rFonts w:hint="eastAsia"/>
-        </w:rPr>
       </w:pPr>
       <w:r>
         <w:rPr>
@@ -1669,9 +1627,9 @@
             <w:tcW w:w="1440" w:type="dxa"/>
             <w:shd w:val="clear" w:color="auto" w:fill="E8EEF5"/>
             <w:tcMar>
-              <w:top w:w="80" w:type="dxa"/>
+              <w:top w:w="90" w:type="dxa"/>
               <w:left w:w="120" w:type="dxa"/>
-              <w:bottom w:w="80" w:type="dxa"/>
+              <w:bottom w:w="90" w:type="dxa"/>
               <w:right w:w="120" w:type="dxa"/>
             </w:tcMar>
             <w:vAlign w:val="center"/>
@@ -1682,9 +1640,9 @@
             </w:pPr>
             <w:r>
               <w:rPr>
-                <w:rFonts w:cs="Calibri"/>
+                <w:rFonts w:ascii="Aptos" w:hAnsi="Aptos" w:cs="Calibri"/>
                 <w:b/>
-                <w:color w:val="1F4D78"/>
+                <w:color w:val="1F4E79"/>
               </w:rPr>
               <w:t>Question</w:t>
             </w:r>
@@ -1695,9 +1653,9 @@
             <w:tcW w:w="5040" w:type="dxa"/>
             <w:shd w:val="clear" w:color="auto" w:fill="E8EEF5"/>
             <w:tcMar>
-              <w:top w:w="80" w:type="dxa"/>
+              <w:top w:w="90" w:type="dxa"/>
               <w:left w:w="120" w:type="dxa"/>
-              <w:bottom w:w="80" w:type="dxa"/>
+              <w:bottom w:w="90" w:type="dxa"/>
               <w:right w:w="120" w:type="dxa"/>
             </w:tcMar>
             <w:vAlign w:val="center"/>
@@ -1708,9 +1666,9 @@
             </w:pPr>
             <w:r>
               <w:rPr>
-                <w:rFonts w:cs="Calibri"/>
+                <w:rFonts w:ascii="Aptos" w:hAnsi="Aptos" w:cs="Calibri"/>
                 <w:b/>
-                <w:color w:val="1F4D78"/>
+                <w:color w:val="1F4E79"/>
               </w:rPr>
               <w:t>Evidence location</w:t>
             </w:r>
@@ -1721,9 +1679,9 @@
             <w:tcW w:w="2880" w:type="dxa"/>
             <w:shd w:val="clear" w:color="auto" w:fill="E8EEF5"/>
             <w:tcMar>
-              <w:top w:w="80" w:type="dxa"/>
+              <w:top w:w="90" w:type="dxa"/>
               <w:left w:w="120" w:type="dxa"/>
-              <w:bottom w:w="80" w:type="dxa"/>
+              <w:bottom w:w="90" w:type="dxa"/>
               <w:right w:w="120" w:type="dxa"/>
             </w:tcMar>
             <w:vAlign w:val="center"/>
@@ -1734,11 +1692,11 @@
             </w:pPr>
             <w:r>
               <w:rPr>
-                <w:rFonts w:cs="Calibri"/>
+                <w:rFonts w:ascii="Aptos" w:hAnsi="Aptos"/>
                 <w:b/>
-                <w:color w:val="1F4D78"/>
+                <w:color w:val="1F4E79"/>
               </w:rPr>
-              <w:t>Answer</w:t>
+              <w:t>Public answer</w:t>
             </w:r>
           </w:p>
         </w:tc>
@@ -1748,9 +1706,9 @@
           <w:tcPr>
             <w:tcW w:w="1440" w:type="dxa"/>
             <w:tcMar>
-              <w:top w:w="80" w:type="dxa"/>
+              <w:top w:w="90" w:type="dxa"/>
               <w:left w:w="120" w:type="dxa"/>
-              <w:bottom w:w="80" w:type="dxa"/>
+              <w:bottom w:w="90" w:type="dxa"/>
               <w:right w:w="120" w:type="dxa"/>
             </w:tcMar>
             <w:vAlign w:val="center"/>
@@ -1773,9 +1731,9 @@
           <w:tcPr>
             <w:tcW w:w="5040" w:type="dxa"/>
             <w:tcMar>
-              <w:top w:w="80" w:type="dxa"/>
+              <w:top w:w="90" w:type="dxa"/>
               <w:left w:w="120" w:type="dxa"/>
-              <w:bottom w:w="80" w:type="dxa"/>
+              <w:bottom w:w="90" w:type="dxa"/>
               <w:right w:w="120" w:type="dxa"/>
             </w:tcMar>
             <w:vAlign w:val="center"/>
@@ -1798,24 +1756,18 @@
           <w:tcPr>
             <w:tcW w:w="2880" w:type="dxa"/>
             <w:tcMar>
-              <w:top w:w="80" w:type="dxa"/>
+              <w:top w:w="90" w:type="dxa"/>
               <w:left w:w="120" w:type="dxa"/>
-              <w:bottom w:w="80" w:type="dxa"/>
+              <w:bottom w:w="90" w:type="dxa"/>
               <w:right w:w="120" w:type="dxa"/>
             </w:tcMar>
             <w:vAlign w:val="center"/>
           </w:tcPr>
           <w:p>
             <w:pPr>
-              <w:spacing w:after="0" w:line="276" w:lineRule="auto"/>
+              <w:spacing w:after="0"/>
             </w:pPr>
             <w:r>
-              <w:rPr>
-                <w:rFonts w:ascii="Consolas" w:hAnsi="Consolas" w:cs="Consolas"/>
-                <w:b/>
-                <w:color w:val="0B2545"/>
-                <w:sz w:val="19"/>
-              </w:rPr>
               <w:t>[REDACTED]</w:t>
             </w:r>
           </w:p>
@@ -1826,9 +1778,9 @@
           <w:tcPr>
             <w:tcW w:w="1440" w:type="dxa"/>
             <w:tcMar>
-              <w:top w:w="80" w:type="dxa"/>
+              <w:top w:w="90" w:type="dxa"/>
               <w:left w:w="120" w:type="dxa"/>
-              <w:bottom w:w="80" w:type="dxa"/>
+              <w:bottom w:w="90" w:type="dxa"/>
               <w:right w:w="120" w:type="dxa"/>
             </w:tcMar>
             <w:vAlign w:val="center"/>
@@ -1851,9 +1803,9 @@
           <w:tcPr>
             <w:tcW w:w="5040" w:type="dxa"/>
             <w:tcMar>
-              <w:top w:w="80" w:type="dxa"/>
+              <w:top w:w="90" w:type="dxa"/>
               <w:left w:w="120" w:type="dxa"/>
-              <w:bottom w:w="80" w:type="dxa"/>
+              <w:bottom w:w="90" w:type="dxa"/>
               <w:right w:w="120" w:type="dxa"/>
             </w:tcMar>
             <w:vAlign w:val="center"/>
@@ -1876,24 +1828,18 @@
           <w:tcPr>
             <w:tcW w:w="2880" w:type="dxa"/>
             <w:tcMar>
-              <w:top w:w="80" w:type="dxa"/>
+              <w:top w:w="90" w:type="dxa"/>
               <w:left w:w="120" w:type="dxa"/>
-              <w:bottom w:w="80" w:type="dxa"/>
+              <w:bottom w:w="90" w:type="dxa"/>
               <w:right w:w="120" w:type="dxa"/>
             </w:tcMar>
             <w:vAlign w:val="center"/>
           </w:tcPr>
           <w:p>
             <w:pPr>
-              <w:spacing w:after="0" w:line="276" w:lineRule="auto"/>
+              <w:spacing w:after="0"/>
             </w:pPr>
             <w:r>
-              <w:rPr>
-                <w:rFonts w:ascii="Consolas" w:hAnsi="Consolas" w:cs="Consolas"/>
-                <w:b/>
-                <w:color w:val="0B2545"/>
-                <w:sz w:val="19"/>
-              </w:rPr>
               <w:t>[REDACTED]</w:t>
             </w:r>
           </w:p>
@@ -1904,9 +1850,9 @@
           <w:tcPr>
             <w:tcW w:w="1440" w:type="dxa"/>
             <w:tcMar>
-              <w:top w:w="80" w:type="dxa"/>
+              <w:top w:w="90" w:type="dxa"/>
               <w:left w:w="120" w:type="dxa"/>
-              <w:bottom w:w="80" w:type="dxa"/>
+              <w:bottom w:w="90" w:type="dxa"/>
               <w:right w:w="120" w:type="dxa"/>
             </w:tcMar>
             <w:vAlign w:val="center"/>
@@ -1929,9 +1875,9 @@
           <w:tcPr>
             <w:tcW w:w="5040" w:type="dxa"/>
             <w:tcMar>
-              <w:top w:w="80" w:type="dxa"/>
+              <w:top w:w="90" w:type="dxa"/>
               <w:left w:w="120" w:type="dxa"/>
-              <w:bottom w:w="80" w:type="dxa"/>
+              <w:bottom w:w="90" w:type="dxa"/>
               <w:right w:w="120" w:type="dxa"/>
             </w:tcMar>
             <w:vAlign w:val="center"/>
@@ -1954,24 +1900,18 @@
           <w:tcPr>
             <w:tcW w:w="2880" w:type="dxa"/>
             <w:tcMar>
-              <w:top w:w="80" w:type="dxa"/>
+              <w:top w:w="90" w:type="dxa"/>
               <w:left w:w="120" w:type="dxa"/>
-              <w:bottom w:w="80" w:type="dxa"/>
+              <w:bottom w:w="90" w:type="dxa"/>
               <w:right w:w="120" w:type="dxa"/>
             </w:tcMar>
             <w:vAlign w:val="center"/>
           </w:tcPr>
           <w:p>
             <w:pPr>
-              <w:spacing w:after="0" w:line="276" w:lineRule="auto"/>
+              <w:spacing w:after="0"/>
             </w:pPr>
             <w:r>
-              <w:rPr>
-                <w:rFonts w:ascii="Consolas" w:hAnsi="Consolas" w:cs="Consolas"/>
-                <w:b/>
-                <w:color w:val="0B2545"/>
-                <w:sz w:val="19"/>
-              </w:rPr>
               <w:t>[REDACTED]</w:t>
             </w:r>
           </w:p>
@@ -1979,9 +1919,157 @@
       </w:tr>
     </w:tbl>
     <w:p/>
+    <w:p>
+      <w:pPr>
+        <w:spacing w:before="120" w:after="0"/>
+      </w:pPr>
+      <w:r>
+        <w:rPr>
+          <w:i/>
+          <w:color w:val="595959"/>
+        </w:rPr>
+        <w:t>The final answers are intentionally redacted in this public version.</w:t>
+      </w:r>
+    </w:p>
+    <w:p>
+      <w:r>
+        <w:br w:type="page"/>
+      </w:r>
+    </w:p>
+    <w:p>
+      <w:pPr>
+        <w:pStyle w:val="Heading1"/>
+      </w:pPr>
+      <w:r>
+        <w:t>Security findings</w:t>
+      </w:r>
+    </w:p>
+    <w:p>
+      <w:pPr>
+        <w:pStyle w:val="ListBullet"/>
+        <w:spacing w:after="60"/>
+      </w:pPr>
+      <w:r>
+        <w:t>Username disclosure through an HTML comment</w:t>
+      </w:r>
+    </w:p>
+    <w:p>
+      <w:pPr>
+        <w:pStyle w:val="ListBullet"/>
+        <w:spacing w:after="60"/>
+      </w:pPr>
+      <w:r>
+        <w:t>Sensitive information exposed through robots.txt</w:t>
+      </w:r>
+    </w:p>
+    <w:p>
+      <w:pPr>
+        <w:pStyle w:val="ListBullet"/>
+        <w:spacing w:after="60"/>
+      </w:pPr>
+      <w:r>
+        <w:t>Authenticated operating-system command execution</w:t>
+      </w:r>
+    </w:p>
+    <w:p>
+      <w:pPr>
+        <w:pStyle w:val="ListBullet"/>
+        <w:spacing w:after="60"/>
+      </w:pPr>
+      <w:r>
+        <w:t>Excessive sudo privileges assigned to the web-service account</w:t>
+      </w:r>
+    </w:p>
+    <w:p>
+      <w:pPr>
+        <w:pStyle w:val="ListBullet"/>
+        <w:spacing w:after="60"/>
+      </w:pPr>
+      <w:r>
+        <w:t>Insufficient separation between the web application and privileged system resources</w:t>
+      </w:r>
+    </w:p>
+    <w:p>
+      <w:pPr>
+        <w:pStyle w:val="Heading1"/>
+      </w:pPr>
+      <w:r>
+        <w:t>Remediation</w:t>
+      </w:r>
+    </w:p>
+    <w:p>
+      <w:pPr>
+        <w:pStyle w:val="ListBullet"/>
+        <w:spacing w:after="60"/>
+      </w:pPr>
+      <w:r>
+        <w:t>Remove sensitive information from HTML comments.</w:t>
+      </w:r>
+    </w:p>
+    <w:p>
+      <w:pPr>
+        <w:pStyle w:val="ListBullet"/>
+        <w:spacing w:after="60"/>
+      </w:pPr>
+      <w:r>
+        <w:t>Never store credentials or secrets in robots.txt.</w:t>
+      </w:r>
+    </w:p>
+    <w:p>
+      <w:pPr>
+        <w:pStyle w:val="ListBullet"/>
+        <w:spacing w:after="60"/>
+      </w:pPr>
+      <w:r>
+        <w:t>Do not pass user-controlled input directly to operating-system commands.</w:t>
+      </w:r>
+    </w:p>
+    <w:p>
+      <w:pPr>
+        <w:pStyle w:val="ListBullet"/>
+        <w:spacing w:after="60"/>
+      </w:pPr>
+      <w:r>
+        <w:t>Replace shell execution with narrowly scoped server-side functions.</w:t>
+      </w:r>
+    </w:p>
+    <w:p>
+      <w:pPr>
+        <w:pStyle w:val="ListBullet"/>
+        <w:spacing w:after="60"/>
+      </w:pPr>
+      <w:r>
+        <w:t>Run the web service with the minimum required privileges.</w:t>
+      </w:r>
+    </w:p>
+    <w:p>
+      <w:pPr>
+        <w:pStyle w:val="ListBullet"/>
+        <w:spacing w:after="60"/>
+      </w:pPr>
+      <w:r>
+        <w:t>Remove unnecessary passwordless sudo permissions from www-data.</w:t>
+      </w:r>
+    </w:p>
+    <w:p>
+      <w:pPr>
+        <w:pStyle w:val="Heading1"/>
+      </w:pPr>
+      <w:r>
+        <w:t>Lessons learned</w:t>
+      </w:r>
+    </w:p>
+    <w:p>
+      <w:pPr>
+        <w:spacing w:after="0"/>
+      </w:pPr>
+      <w:r>
+        <w:t>This room demonstrated how several small weaknesses can be chained together. Information disclosure provided valid credentials, the authenticated command portal enabled filesystem enumeration, and excessive sudo privileges allowed access to files owned by the root user.</w:t>
+      </w:r>
+    </w:p>
     <w:sectPr>
-      <w:footerReference w:type="default" r:id="rId23"/>
-      <w:headerReference w:type="default" r:id="rId26"/>
+      <w:headerReference w:type="default" r:id="rId23"/>
+      <w:footerReference w:type="default" r:id="rId24"/>
       <w:pgSz w:w="12240" w:h="15840"/>
       <w:pgMar w:top="1440" w:right="1440" w:bottom="1440" w:left="1440" w:header="708" w:footer="708" w:gutter="0"/>
       <w:cols w:space="720"/>
@@ -2101,7 +2189,7 @@
 </file>
 
 <file path=word/header1.xml><?xml version="1.0" encoding="utf-8"?>
-<w:hdr xmlns:m="http://schemas.openxmlformats.org/officeDocument/2006/math" xmlns:mc="http://schemas.openxmlformats.org/markup-compatibility/2006" xmlns:mo="http://schemas.microsoft.com/office/mac/office/2008/main" xmlns:mv="urn:schemas-microsoft-com:mac:vml" xmlns:o="urn:schemas-microsoft-com:office:office" xmlns:r="http://schemas.openxmlformats.org/officeDocument/2006/relationships" xmlns:v="urn:schemas-microsoft-com:vml" xmlns:w10="urn:schemas-microsoft-com:office:word" xmlns:w14="http://schemas.microsoft.com/office/word/2010/wordml" xmlns:w="http://schemas.openxmlformats.org/wordprocessingml/2006/main" xmlns:wne="http://schemas.microsoft.com/office/word/2006/wordml" xmlns:wp14="http://schemas.microsoft.com/office/word/2010/wordprocessingDrawing" xmlns:wp="http://schemas.openxmlformats.org/drawingml/2006/wordprocessingDrawing" xmlns:wpc="http://schemas.microsoft.com/office/word/2010/wordprocessingCanvas" xmlns:wpg="http://schemas.microsoft.com/office/word/2010/wordprocessingGroup" xmlns:wpi="http://schemas.microsoft.com/office/word/2010/wordprocessingInk" xmlns:wps="http://schemas.microsoft.com/office/word/2010/wordprocessingShape" mc:Ignorable="w14 wp14">
+<w:hdr xmlns:wpc="http://schemas.microsoft.com/office/word/2010/wordprocessingCanvas" xmlns:cx="http://schemas.microsoft.com/office/drawing/2014/chartex" xmlns:cx1="http://schemas.microsoft.com/office/drawing/2015/9/8/chartex" xmlns:cx2="http://schemas.microsoft.com/office/drawing/2015/10/21/chartex" xmlns:cx3="http://schemas.microsoft.com/office/drawing/2016/5/9/chartex" xmlns:cx4="http://schemas.microsoft.com/office/drawing/2016/5/10/chartex" xmlns:cx5="http://schemas.microsoft.com/office/drawing/2016/5/11/chartex" xmlns:cx6="http://schemas.microsoft.com/office/drawing/2016/5/12/chartex" xmlns:cx7="http://schemas.microsoft.com/office/drawing/2016/5/13/chartex" xmlns:cx8="http://schemas.microsoft.com/office/drawing/2016/5/14/chartex" xmlns:mc="http://schemas.openxmlformats.org/markup-compatibility/2006" xmlns:aink="http://schemas.microsoft.com/office/drawing/2016/ink" xmlns:am3d="http://schemas.microsoft.com/office/drawing/2017/model3d" xmlns:o="urn:schemas-microsoft-com:office:office" xmlns:oel="http://schemas.microsoft.com/office/2019/extlst" xmlns:r="http://schemas.openxmlformats.org/officeDocument/2006/relationships" xmlns:m="http://schemas.openxmlformats.org/officeDocument/2006/math" xmlns:v="urn:schemas-microsoft-com:vml" xmlns:wp14="http://schemas.microsoft.com/office/word/2010/wordprocessingDrawing" xmlns:wp="http://schemas.openxmlformats.org/drawingml/2006/wordprocessingDrawing" xmlns:w10="urn:schemas-microsoft-com:office:word" xmlns:w="http://schemas.openxmlformats.org/wordprocessingml/2006/main" xmlns:w14="http://schemas.microsoft.com/office/word/2010/wordml" xmlns:w15="http://schemas.microsoft.com/office/word/2012/wordml" xmlns:w16cex="http://schemas.microsoft.com/office/word/2018/wordml/cex" xmlns:w16cid="http://schemas.microsoft.com/office/word/2016/wordml/cid" xmlns:w16="http://schemas.microsoft.com/office/word/2018/wordml" xmlns:w16du="http://schemas.microsoft.com/office/word/2023/wordml/word16du" xmlns:w16sdtdh="http://schemas.microsoft.com/office/word/2020/wordml/sdtdatahash" xmlns:w16sdtfl="http://schemas.microsoft.com/office/word/2024/wordml/sdtformatlock" xmlns:w16se="http://schemas.microsoft.com/office/word/2015/wordml/symex" xmlns:wpg="http://schemas.microsoft.com/office/word/2010/wordprocessingGroup" xmlns:wpi="http://schemas.microsoft.com/office/word/2010/wordprocessingInk" xmlns:wne="http://schemas.microsoft.com/office/word/2006/wordml" xmlns:wps="http://schemas.microsoft.com/office/word/2010/wordprocessingShape" mc:Ignorable="w14 w15 w16se w16cid w16 w16cex w16sdtdh w16sdtfl w16du wp14">
   <w:p>
     <w:pPr>
       <w:pStyle w:val="Header"/>

</xml_diff>

<commit_message>
Improve Pickle Rick security analysis and document exports
Adds the completed public answer summary, security findings, remediation, and lessons learned. Rebuilds the Word and PDF exports while preserving answer redactions.
</commit_message>
<xml_diff>
--- a/Pickle-Rick-Writeup-Redacted.docx
+++ b/Pickle-Rick-Writeup-Redacted.docx
@@ -188,9 +188,6 @@
         <w:shd w:val="clear" w:color="auto" w:fill="F4F6F9"/>
         <w:spacing w:before="40" w:line="240" w:lineRule="auto"/>
         <w:ind w:left="202" w:right="72"/>
-        <w:rPr>
-          <w:rFonts w:hint="eastAsia"/>
-        </w:rPr>
       </w:pPr>
       <w:r>
         <w:rPr>
@@ -410,9 +407,6 @@
         <w:shd w:val="clear" w:color="auto" w:fill="F4F6F9"/>
         <w:spacing w:before="40" w:line="240" w:lineRule="auto"/>
         <w:ind w:left="202" w:right="72"/>
-        <w:rPr>
-          <w:rFonts w:hint="eastAsia"/>
-        </w:rPr>
       </w:pPr>
       <w:r>
         <w:rPr>
@@ -586,7 +580,6 @@
           <w:b/>
           <w:color w:val="1F4D78"/>
         </w:rPr>
-        <w:lastRenderedPageBreak/>
         <w:t xml:space="preserve">Password candidate: </w:t>
       </w:r>
       <w:r>
@@ -731,9 +724,6 @@
         <w:shd w:val="clear" w:color="auto" w:fill="F4F6F9"/>
         <w:spacing w:before="40" w:line="240" w:lineRule="auto"/>
         <w:ind w:left="202" w:right="72"/>
-        <w:rPr>
-          <w:rFonts w:hint="eastAsia"/>
-        </w:rPr>
       </w:pPr>
       <w:r>
         <w:rPr>
@@ -754,7 +744,6 @@
         <w:rPr>
           <w:rFonts w:cs="Calibri"/>
         </w:rPr>
-        <w:lastRenderedPageBreak/>
         <w:t>Evidence - Listing the files in the web directory.</w:t>
       </w:r>
     </w:p>
@@ -824,9 +813,6 @@
         <w:shd w:val="clear" w:color="auto" w:fill="F4F6F9"/>
         <w:spacing w:before="40" w:line="240" w:lineRule="auto"/>
         <w:ind w:left="202" w:right="72"/>
-        <w:rPr>
-          <w:rFonts w:hint="eastAsia"/>
-        </w:rPr>
       </w:pPr>
       <w:r>
         <w:rPr>
@@ -952,9 +938,6 @@
         <w:shd w:val="clear" w:color="auto" w:fill="F4F6F9"/>
         <w:spacing w:before="40" w:line="240" w:lineRule="auto"/>
         <w:ind w:left="202" w:right="72"/>
-        <w:rPr>
-          <w:rFonts w:hint="eastAsia"/>
-        </w:rPr>
       </w:pPr>
       <w:r>
         <w:rPr>
@@ -975,7 +958,6 @@
         <w:rPr>
           <w:rFonts w:cs="Calibri"/>
         </w:rPr>
-        <w:lastRenderedPageBreak/>
         <w:t>Evidence - Root filesystem listing.</w:t>
       </w:r>
     </w:p>
@@ -1036,9 +1018,6 @@
         <w:shd w:val="clear" w:color="auto" w:fill="F4F6F9"/>
         <w:spacing w:before="40" w:line="240" w:lineRule="auto"/>
         <w:ind w:left="202" w:right="72"/>
-        <w:rPr>
-          <w:rFonts w:hint="eastAsia"/>
-        </w:rPr>
       </w:pPr>
       <w:r>
         <w:rPr>
@@ -1119,9 +1098,6 @@
         <w:shd w:val="clear" w:color="auto" w:fill="F4F6F9"/>
         <w:spacing w:before="40" w:line="240" w:lineRule="auto"/>
         <w:ind w:left="202" w:right="72"/>
-        <w:rPr>
-          <w:rFonts w:hint="eastAsia"/>
-        </w:rPr>
       </w:pPr>
       <w:r>
         <w:rPr>
@@ -1210,16 +1186,12 @@
         <w:shd w:val="clear" w:color="auto" w:fill="F4F6F9"/>
         <w:spacing w:before="40" w:line="240" w:lineRule="auto"/>
         <w:ind w:left="202" w:right="72"/>
-        <w:rPr>
-          <w:rFonts w:hint="eastAsia"/>
-        </w:rPr>
       </w:pPr>
       <w:r>
         <w:rPr>
           <w:rFonts w:cs="Consolas"/>
           <w:color w:val="0B2545"/>
         </w:rPr>
-        <w:lastRenderedPageBreak/>
         <w:t>less /home/rick/"second ingredients"</w:t>
       </w:r>
     </w:p>
@@ -1339,9 +1311,6 @@
         <w:shd w:val="clear" w:color="auto" w:fill="F4F6F9"/>
         <w:spacing w:before="40" w:line="240" w:lineRule="auto"/>
         <w:ind w:left="202" w:right="72"/>
-        <w:rPr>
-          <w:rFonts w:hint="eastAsia"/>
-        </w:rPr>
       </w:pPr>
       <w:r>
         <w:rPr>
@@ -1423,11 +1392,7 @@
     </w:p>
     <w:p>
       <w:r>
-        <w:rPr>
-          <w:rFonts w:cs="Calibri"/>
-          <w:color w:val="000000"/>
-        </w:rPr>
-        <w:t>To determine whether the web-service account could execute commands with elevated privileges, I tested access to the root user's home directory using sudo ls /root. The command executed successfully without requesting a password, confirming that the account had excessive sudo privileges.</w:t>
+        <w:t>To determine whether the web-service account could execute commands with elevated privileges, I tested access to the root user's home directory using sudo ls /root. The command executed successfully without requesting a password, demonstrating that the web-service account could use sudo to access privileged resources. Because a complete sudo -l output was not captured, the exact scope of the account's sudo permissions was not verified.</w:t>
       </w:r>
     </w:p>
     <w:p>
@@ -1440,9 +1405,6 @@
         <w:shd w:val="clear" w:color="auto" w:fill="F4F6F9"/>
         <w:spacing w:before="40" w:line="240" w:lineRule="auto"/>
         <w:ind w:left="202" w:right="72"/>
-        <w:rPr>
-          <w:rFonts w:hint="eastAsia"/>
-        </w:rPr>
       </w:pPr>
       <w:r>
         <w:rPr>
@@ -1463,7 +1425,6 @@
         <w:rPr>
           <w:rFonts w:cs="Calibri"/>
         </w:rPr>
-        <w:lastRenderedPageBreak/>
         <w:t>Evidence - Elevated listing of /root.</w:t>
       </w:r>
     </w:p>
@@ -1532,9 +1493,6 @@
         <w:shd w:val="clear" w:color="auto" w:fill="F4F6F9"/>
         <w:spacing w:before="40" w:line="240" w:lineRule="auto"/>
         <w:ind w:left="202" w:right="72"/>
-        <w:rPr>
-          <w:rFonts w:hint="eastAsia"/>
-        </w:rPr>
       </w:pPr>
       <w:r>
         <w:rPr>
@@ -1669,9 +1627,9 @@
             <w:tcW w:w="1440" w:type="dxa"/>
             <w:shd w:val="clear" w:color="auto" w:fill="E8EEF5"/>
             <w:tcMar>
-              <w:top w:w="80" w:type="dxa"/>
+              <w:top w:w="90" w:type="dxa"/>
               <w:left w:w="120" w:type="dxa"/>
-              <w:bottom w:w="80" w:type="dxa"/>
+              <w:bottom w:w="90" w:type="dxa"/>
               <w:right w:w="120" w:type="dxa"/>
             </w:tcMar>
             <w:vAlign w:val="center"/>
@@ -1682,9 +1640,9 @@
             </w:pPr>
             <w:r>
               <w:rPr>
-                <w:rFonts w:cs="Calibri"/>
+                <w:rFonts w:ascii="Aptos" w:hAnsi="Aptos" w:cs="Calibri"/>
                 <w:b/>
-                <w:color w:val="1F4D78"/>
+                <w:color w:val="1F4E79"/>
               </w:rPr>
               <w:t>Question</w:t>
             </w:r>
@@ -1695,9 +1653,9 @@
             <w:tcW w:w="5040" w:type="dxa"/>
             <w:shd w:val="clear" w:color="auto" w:fill="E8EEF5"/>
             <w:tcMar>
-              <w:top w:w="80" w:type="dxa"/>
+              <w:top w:w="90" w:type="dxa"/>
               <w:left w:w="120" w:type="dxa"/>
-              <w:bottom w:w="80" w:type="dxa"/>
+              <w:bottom w:w="90" w:type="dxa"/>
               <w:right w:w="120" w:type="dxa"/>
             </w:tcMar>
             <w:vAlign w:val="center"/>
@@ -1708,9 +1666,9 @@
             </w:pPr>
             <w:r>
               <w:rPr>
-                <w:rFonts w:cs="Calibri"/>
+                <w:rFonts w:ascii="Aptos" w:hAnsi="Aptos" w:cs="Calibri"/>
                 <w:b/>
-                <w:color w:val="1F4D78"/>
+                <w:color w:val="1F4E79"/>
               </w:rPr>
               <w:t>Evidence location</w:t>
             </w:r>
@@ -1721,9 +1679,9 @@
             <w:tcW w:w="2880" w:type="dxa"/>
             <w:shd w:val="clear" w:color="auto" w:fill="E8EEF5"/>
             <w:tcMar>
-              <w:top w:w="80" w:type="dxa"/>
+              <w:top w:w="90" w:type="dxa"/>
               <w:left w:w="120" w:type="dxa"/>
-              <w:bottom w:w="80" w:type="dxa"/>
+              <w:bottom w:w="90" w:type="dxa"/>
               <w:right w:w="120" w:type="dxa"/>
             </w:tcMar>
             <w:vAlign w:val="center"/>
@@ -1734,11 +1692,11 @@
             </w:pPr>
             <w:r>
               <w:rPr>
-                <w:rFonts w:cs="Calibri"/>
+                <w:rFonts w:ascii="Aptos" w:hAnsi="Aptos"/>
                 <w:b/>
-                <w:color w:val="1F4D78"/>
+                <w:color w:val="1F4E79"/>
               </w:rPr>
-              <w:t>Answer</w:t>
+              <w:t>Public answer</w:t>
             </w:r>
           </w:p>
         </w:tc>
@@ -1748,9 +1706,9 @@
           <w:tcPr>
             <w:tcW w:w="1440" w:type="dxa"/>
             <w:tcMar>
-              <w:top w:w="80" w:type="dxa"/>
+              <w:top w:w="90" w:type="dxa"/>
               <w:left w:w="120" w:type="dxa"/>
-              <w:bottom w:w="80" w:type="dxa"/>
+              <w:bottom w:w="90" w:type="dxa"/>
               <w:right w:w="120" w:type="dxa"/>
             </w:tcMar>
             <w:vAlign w:val="center"/>
@@ -1773,9 +1731,9 @@
           <w:tcPr>
             <w:tcW w:w="5040" w:type="dxa"/>
             <w:tcMar>
-              <w:top w:w="80" w:type="dxa"/>
+              <w:top w:w="90" w:type="dxa"/>
               <w:left w:w="120" w:type="dxa"/>
-              <w:bottom w:w="80" w:type="dxa"/>
+              <w:bottom w:w="90" w:type="dxa"/>
               <w:right w:w="120" w:type="dxa"/>
             </w:tcMar>
             <w:vAlign w:val="center"/>
@@ -1798,24 +1756,18 @@
           <w:tcPr>
             <w:tcW w:w="2880" w:type="dxa"/>
             <w:tcMar>
-              <w:top w:w="80" w:type="dxa"/>
+              <w:top w:w="90" w:type="dxa"/>
               <w:left w:w="120" w:type="dxa"/>
-              <w:bottom w:w="80" w:type="dxa"/>
+              <w:bottom w:w="90" w:type="dxa"/>
               <w:right w:w="120" w:type="dxa"/>
             </w:tcMar>
             <w:vAlign w:val="center"/>
           </w:tcPr>
           <w:p>
             <w:pPr>
-              <w:spacing w:after="0" w:line="276" w:lineRule="auto"/>
+              <w:spacing w:after="0"/>
             </w:pPr>
             <w:r>
-              <w:rPr>
-                <w:rFonts w:ascii="Consolas" w:hAnsi="Consolas" w:cs="Consolas"/>
-                <w:b/>
-                <w:color w:val="0B2545"/>
-                <w:sz w:val="19"/>
-              </w:rPr>
               <w:t>[REDACTED]</w:t>
             </w:r>
           </w:p>
@@ -1826,9 +1778,9 @@
           <w:tcPr>
             <w:tcW w:w="1440" w:type="dxa"/>
             <w:tcMar>
-              <w:top w:w="80" w:type="dxa"/>
+              <w:top w:w="90" w:type="dxa"/>
               <w:left w:w="120" w:type="dxa"/>
-              <w:bottom w:w="80" w:type="dxa"/>
+              <w:bottom w:w="90" w:type="dxa"/>
               <w:right w:w="120" w:type="dxa"/>
             </w:tcMar>
             <w:vAlign w:val="center"/>
@@ -1851,9 +1803,9 @@
           <w:tcPr>
             <w:tcW w:w="5040" w:type="dxa"/>
             <w:tcMar>
-              <w:top w:w="80" w:type="dxa"/>
+              <w:top w:w="90" w:type="dxa"/>
               <w:left w:w="120" w:type="dxa"/>
-              <w:bottom w:w="80" w:type="dxa"/>
+              <w:bottom w:w="90" w:type="dxa"/>
               <w:right w:w="120" w:type="dxa"/>
             </w:tcMar>
             <w:vAlign w:val="center"/>
@@ -1876,24 +1828,18 @@
           <w:tcPr>
             <w:tcW w:w="2880" w:type="dxa"/>
             <w:tcMar>
-              <w:top w:w="80" w:type="dxa"/>
+              <w:top w:w="90" w:type="dxa"/>
               <w:left w:w="120" w:type="dxa"/>
-              <w:bottom w:w="80" w:type="dxa"/>
+              <w:bottom w:w="90" w:type="dxa"/>
               <w:right w:w="120" w:type="dxa"/>
             </w:tcMar>
             <w:vAlign w:val="center"/>
           </w:tcPr>
           <w:p>
             <w:pPr>
-              <w:spacing w:after="0" w:line="276" w:lineRule="auto"/>
+              <w:spacing w:after="0"/>
             </w:pPr>
             <w:r>
-              <w:rPr>
-                <w:rFonts w:ascii="Consolas" w:hAnsi="Consolas" w:cs="Consolas"/>
-                <w:b/>
-                <w:color w:val="0B2545"/>
-                <w:sz w:val="19"/>
-              </w:rPr>
               <w:t>[REDACTED]</w:t>
             </w:r>
           </w:p>
@@ -1904,9 +1850,9 @@
           <w:tcPr>
             <w:tcW w:w="1440" w:type="dxa"/>
             <w:tcMar>
-              <w:top w:w="80" w:type="dxa"/>
+              <w:top w:w="90" w:type="dxa"/>
               <w:left w:w="120" w:type="dxa"/>
-              <w:bottom w:w="80" w:type="dxa"/>
+              <w:bottom w:w="90" w:type="dxa"/>
               <w:right w:w="120" w:type="dxa"/>
             </w:tcMar>
             <w:vAlign w:val="center"/>
@@ -1929,9 +1875,9 @@
           <w:tcPr>
             <w:tcW w:w="5040" w:type="dxa"/>
             <w:tcMar>
-              <w:top w:w="80" w:type="dxa"/>
+              <w:top w:w="90" w:type="dxa"/>
               <w:left w:w="120" w:type="dxa"/>
-              <w:bottom w:w="80" w:type="dxa"/>
+              <w:bottom w:w="90" w:type="dxa"/>
               <w:right w:w="120" w:type="dxa"/>
             </w:tcMar>
             <w:vAlign w:val="center"/>
@@ -1954,24 +1900,18 @@
           <w:tcPr>
             <w:tcW w:w="2880" w:type="dxa"/>
             <w:tcMar>
-              <w:top w:w="80" w:type="dxa"/>
+              <w:top w:w="90" w:type="dxa"/>
               <w:left w:w="120" w:type="dxa"/>
-              <w:bottom w:w="80" w:type="dxa"/>
+              <w:bottom w:w="90" w:type="dxa"/>
               <w:right w:w="120" w:type="dxa"/>
             </w:tcMar>
             <w:vAlign w:val="center"/>
           </w:tcPr>
           <w:p>
             <w:pPr>
-              <w:spacing w:after="0" w:line="276" w:lineRule="auto"/>
+              <w:spacing w:after="0"/>
             </w:pPr>
             <w:r>
-              <w:rPr>
-                <w:rFonts w:ascii="Consolas" w:hAnsi="Consolas" w:cs="Consolas"/>
-                <w:b/>
-                <w:color w:val="0B2545"/>
-                <w:sz w:val="19"/>
-              </w:rPr>
               <w:t>[REDACTED]</w:t>
             </w:r>
           </w:p>
@@ -1979,9 +1919,157 @@
       </w:tr>
     </w:tbl>
     <w:p/>
+    <w:p>
+      <w:pPr>
+        <w:spacing w:before="120" w:after="0"/>
+      </w:pPr>
+      <w:r>
+        <w:rPr>
+          <w:i/>
+          <w:color w:val="595959"/>
+        </w:rPr>
+        <w:t>The final answers are intentionally redacted in this public version.</w:t>
+      </w:r>
+    </w:p>
+    <w:p>
+      <w:r>
+        <w:br w:type="page"/>
+      </w:r>
+    </w:p>
+    <w:p>
+      <w:pPr>
+        <w:pStyle w:val="Heading1"/>
+      </w:pPr>
+      <w:r>
+        <w:t>Security findings</w:t>
+      </w:r>
+    </w:p>
+    <w:p>
+      <w:pPr>
+        <w:pStyle w:val="ListBullet"/>
+        <w:spacing w:after="60"/>
+      </w:pPr>
+      <w:r>
+        <w:t>Username disclosure through an HTML comment</w:t>
+      </w:r>
+    </w:p>
+    <w:p>
+      <w:pPr>
+        <w:pStyle w:val="ListBullet"/>
+        <w:spacing w:after="60"/>
+      </w:pPr>
+      <w:r>
+        <w:t>Sensitive information exposed through robots.txt</w:t>
+      </w:r>
+    </w:p>
+    <w:p>
+      <w:pPr>
+        <w:pStyle w:val="ListBullet"/>
+        <w:spacing w:after="60"/>
+      </w:pPr>
+      <w:r>
+        <w:t>Authenticated operating-system command execution</w:t>
+      </w:r>
+    </w:p>
+    <w:p>
+      <w:pPr>
+        <w:pStyle w:val="ListBullet"/>
+        <w:spacing w:after="60"/>
+      </w:pPr>
+      <w:r>
+        <w:t>Excessive sudo privileges assigned to the web-service account</w:t>
+      </w:r>
+    </w:p>
+    <w:p>
+      <w:pPr>
+        <w:pStyle w:val="ListBullet"/>
+        <w:spacing w:after="60"/>
+      </w:pPr>
+      <w:r>
+        <w:t>Insufficient separation between the web application and privileged system resources</w:t>
+      </w:r>
+    </w:p>
+    <w:p>
+      <w:pPr>
+        <w:pStyle w:val="Heading1"/>
+      </w:pPr>
+      <w:r>
+        <w:t>Remediation</w:t>
+      </w:r>
+    </w:p>
+    <w:p>
+      <w:pPr>
+        <w:pStyle w:val="ListBullet"/>
+        <w:spacing w:after="60"/>
+      </w:pPr>
+      <w:r>
+        <w:t>Remove sensitive information from HTML comments.</w:t>
+      </w:r>
+    </w:p>
+    <w:p>
+      <w:pPr>
+        <w:pStyle w:val="ListBullet"/>
+        <w:spacing w:after="60"/>
+      </w:pPr>
+      <w:r>
+        <w:t>Never store credentials or secrets in robots.txt.</w:t>
+      </w:r>
+    </w:p>
+    <w:p>
+      <w:pPr>
+        <w:pStyle w:val="ListBullet"/>
+        <w:spacing w:after="60"/>
+      </w:pPr>
+      <w:r>
+        <w:t>Do not pass user-controlled input directly to operating-system commands.</w:t>
+      </w:r>
+    </w:p>
+    <w:p>
+      <w:pPr>
+        <w:pStyle w:val="ListBullet"/>
+        <w:spacing w:after="60"/>
+      </w:pPr>
+      <w:r>
+        <w:t>Replace shell execution with narrowly scoped server-side functions.</w:t>
+      </w:r>
+    </w:p>
+    <w:p>
+      <w:pPr>
+        <w:pStyle w:val="ListBullet"/>
+        <w:spacing w:after="60"/>
+      </w:pPr>
+      <w:r>
+        <w:t>Run the web service with the minimum required privileges.</w:t>
+      </w:r>
+    </w:p>
+    <w:p>
+      <w:pPr>
+        <w:pStyle w:val="ListBullet"/>
+        <w:spacing w:after="60"/>
+      </w:pPr>
+      <w:r>
+        <w:t>Remove unnecessary passwordless sudo permissions from www-data.</w:t>
+      </w:r>
+    </w:p>
+    <w:p>
+      <w:pPr>
+        <w:pStyle w:val="Heading1"/>
+      </w:pPr>
+      <w:r>
+        <w:t>Lessons learned</w:t>
+      </w:r>
+    </w:p>
+    <w:p>
+      <w:pPr>
+        <w:spacing w:after="0"/>
+      </w:pPr>
+      <w:r>
+        <w:t>This room demonstrated how several small weaknesses can be chained together. Information disclosure provided valid credentials, the authenticated command portal enabled filesystem enumeration, and excessive sudo privileges allowed access to files owned by the root user.</w:t>
+      </w:r>
+    </w:p>
     <w:sectPr>
-      <w:footerReference w:type="default" r:id="rId23"/>
-      <w:headerReference w:type="default" r:id="rId26"/>
+      <w:headerReference w:type="default" r:id="rId23"/>
+      <w:footerReference w:type="default" r:id="rId24"/>
       <w:pgSz w:w="12240" w:h="15840"/>
       <w:pgMar w:top="1440" w:right="1440" w:bottom="1440" w:left="1440" w:header="708" w:footer="708" w:gutter="0"/>
       <w:cols w:space="720"/>
@@ -2101,7 +2189,7 @@
 </file>
 
 <file path=word/header1.xml><?xml version="1.0" encoding="utf-8"?>
-<w:hdr xmlns:m="http://schemas.openxmlformats.org/officeDocument/2006/math" xmlns:mc="http://schemas.openxmlformats.org/markup-compatibility/2006" xmlns:mo="http://schemas.microsoft.com/office/mac/office/2008/main" xmlns:mv="urn:schemas-microsoft-com:mac:vml" xmlns:o="urn:schemas-microsoft-com:office:office" xmlns:r="http://schemas.openxmlformats.org/officeDocument/2006/relationships" xmlns:v="urn:schemas-microsoft-com:vml" xmlns:w10="urn:schemas-microsoft-com:office:word" xmlns:w14="http://schemas.microsoft.com/office/word/2010/wordml" xmlns:w="http://schemas.openxmlformats.org/wordprocessingml/2006/main" xmlns:wne="http://schemas.microsoft.com/office/word/2006/wordml" xmlns:wp14="http://schemas.microsoft.com/office/word/2010/wordprocessingDrawing" xmlns:wp="http://schemas.openxmlformats.org/drawingml/2006/wordprocessingDrawing" xmlns:wpc="http://schemas.microsoft.com/office/word/2010/wordprocessingCanvas" xmlns:wpg="http://schemas.microsoft.com/office/word/2010/wordprocessingGroup" xmlns:wpi="http://schemas.microsoft.com/office/word/2010/wordprocessingInk" xmlns:wps="http://schemas.microsoft.com/office/word/2010/wordprocessingShape" mc:Ignorable="w14 wp14">
+<w:hdr xmlns:wpc="http://schemas.microsoft.com/office/word/2010/wordprocessingCanvas" xmlns:cx="http://schemas.microsoft.com/office/drawing/2014/chartex" xmlns:cx1="http://schemas.microsoft.com/office/drawing/2015/9/8/chartex" xmlns:cx2="http://schemas.microsoft.com/office/drawing/2015/10/21/chartex" xmlns:cx3="http://schemas.microsoft.com/office/drawing/2016/5/9/chartex" xmlns:cx4="http://schemas.microsoft.com/office/drawing/2016/5/10/chartex" xmlns:cx5="http://schemas.microsoft.com/office/drawing/2016/5/11/chartex" xmlns:cx6="http://schemas.microsoft.com/office/drawing/2016/5/12/chartex" xmlns:cx7="http://schemas.microsoft.com/office/drawing/2016/5/13/chartex" xmlns:cx8="http://schemas.microsoft.com/office/drawing/2016/5/14/chartex" xmlns:mc="http://schemas.openxmlformats.org/markup-compatibility/2006" xmlns:aink="http://schemas.microsoft.com/office/drawing/2016/ink" xmlns:am3d="http://schemas.microsoft.com/office/drawing/2017/model3d" xmlns:o="urn:schemas-microsoft-com:office:office" xmlns:oel="http://schemas.microsoft.com/office/2019/extlst" xmlns:r="http://schemas.openxmlformats.org/officeDocument/2006/relationships" xmlns:m="http://schemas.openxmlformats.org/officeDocument/2006/math" xmlns:v="urn:schemas-microsoft-com:vml" xmlns:wp14="http://schemas.microsoft.com/office/word/2010/wordprocessingDrawing" xmlns:wp="http://schemas.openxmlformats.org/drawingml/2006/wordprocessingDrawing" xmlns:w10="urn:schemas-microsoft-com:office:word" xmlns:w="http://schemas.openxmlformats.org/wordprocessingml/2006/main" xmlns:w14="http://schemas.microsoft.com/office/word/2010/wordml" xmlns:w15="http://schemas.microsoft.com/office/word/2012/wordml" xmlns:w16cex="http://schemas.microsoft.com/office/word/2018/wordml/cex" xmlns:w16cid="http://schemas.microsoft.com/office/word/2016/wordml/cid" xmlns:w16="http://schemas.microsoft.com/office/word/2018/wordml" xmlns:w16du="http://schemas.microsoft.com/office/word/2023/wordml/word16du" xmlns:w16sdtdh="http://schemas.microsoft.com/office/word/2020/wordml/sdtdatahash" xmlns:w16sdtfl="http://schemas.microsoft.com/office/word/2024/wordml/sdtformatlock" xmlns:w16se="http://schemas.microsoft.com/office/word/2015/wordml/symex" xmlns:wpg="http://schemas.microsoft.com/office/word/2010/wordprocessingGroup" xmlns:wpi="http://schemas.microsoft.com/office/word/2010/wordprocessingInk" xmlns:wne="http://schemas.microsoft.com/office/word/2006/wordml" xmlns:wps="http://schemas.microsoft.com/office/word/2010/wordprocessingShape" mc:Ignorable="w14 w15 w16se w16cid w16 w16cex w16sdtdh w16sdtfl w16du wp14">
   <w:p>
     <w:pPr>
       <w:pStyle w:val="Header"/>

</xml_diff>

<commit_message>
Update reconnaissance evidence image
</commit_message>
<xml_diff>
--- a/Pickle-Rick-Writeup-Redacted.docx
+++ b/Pickle-Rick-Writeup-Redacted.docx
@@ -231,7 +231,7 @@
         </w:rPr>
         <w:drawing>
           <wp:inline distT="0" distB="0" distL="0" distR="0" wp14:anchorId="5E02BFB9" wp14:editId="2A82131F">
-            <wp:extent cx="3004816" cy="2788920"/>
+            <wp:extent cx="5486400" cy="1609200"/>
             <wp:effectExtent l="0" t="0" r="0" b="0"/>
             <wp:docPr id="1" name="Picture 1" descr="Nmap output showing SSH on port 22 and HTTP on port 80"/>
             <wp:cNvGraphicFramePr>
@@ -253,7 +253,7 @@
                   <pic:spPr>
                     <a:xfrm>
                       <a:off x="0" y="0"/>
-                      <a:ext cx="3004816" cy="2788920"/>
+                      <a:ext cx="5486400" cy="1609200"/>
                     </a:xfrm>
                     <a:prstGeom prst="rect">
                       <a:avLst/>

</xml_diff>

<commit_message>
Update Pickle Rick reconnaissance evidence image
Replaces the reconnaissance screenshot with the supplied cropped Nmap evidence image in GitHub, Word, and PDF while preserving the existing redactions.
</commit_message>
<xml_diff>
--- a/Pickle-Rick-Writeup-Redacted.docx
+++ b/Pickle-Rick-Writeup-Redacted.docx
@@ -231,7 +231,7 @@
         </w:rPr>
         <w:drawing>
           <wp:inline distT="0" distB="0" distL="0" distR="0" wp14:anchorId="5E02BFB9" wp14:editId="2A82131F">
-            <wp:extent cx="3004816" cy="2788920"/>
+            <wp:extent cx="5486400" cy="1609200"/>
             <wp:effectExtent l="0" t="0" r="0" b="0"/>
             <wp:docPr id="1" name="Picture 1" descr="Nmap output showing SSH on port 22 and HTTP on port 80"/>
             <wp:cNvGraphicFramePr>
@@ -253,7 +253,7 @@
                   <pic:spPr>
                     <a:xfrm>
                       <a:off x="0" y="0"/>
-                      <a:ext cx="3004816" cy="2788920"/>
+                      <a:ext cx="5486400" cy="1609200"/>
                     </a:xfrm>
                     <a:prstGeom prst="rect">
                       <a:avLst/>

</xml_diff>